<commit_message>
show and degree work need to work on run and extend
</commit_message>
<xml_diff>
--- a/readme.docx
+++ b/readme.docx
@@ -90,7 +90,7 @@
     <w:p>
       <w:pPr>
         <w:rPr>
-          <w:rFonts w:hint="cs"/>
+          <w:rtl/>
         </w:rPr>
       </w:pPr>
       <w:r>
@@ -100,6 +100,43 @@
         </w:rPr>
         <w:t xml:space="preserve">כאשר רוצים להרחיב ביותר מדרגה אחת או לרדת יותר מדרגה אחת שמים בטקסט בוקס שליד </w:t>
       </w:r>
+    </w:p>
+    <w:p>
+      <w:pPr>
+        <w:rPr>
+          <w:rtl/>
+        </w:rPr>
+      </w:pPr>
+    </w:p>
+    <w:p>
+      <w:pPr>
+        <w:rPr>
+          <w:rFonts w:hint="cs"/>
+          <w:rtl/>
+        </w:rPr>
+      </w:pPr>
+      <w:r>
+        <w:rPr>
+          <w:rFonts w:hint="cs"/>
+          <w:rtl/>
+        </w:rPr>
+        <w:t xml:space="preserve">בשביל לראות היסטוריה מסוימת או להפעיל מחדש צריך לסמן שורה </w:t>
+      </w:r>
+    </w:p>
+    <w:p>
+      <w:pPr>
+        <w:rPr>
+          <w:rtl/>
+        </w:rPr>
+      </w:pPr>
+    </w:p>
+    <w:p>
+      <w:pPr>
+        <w:rPr>
+          <w:rFonts w:hint="cs"/>
+          <w:rtl/>
+        </w:rPr>
+      </w:pPr>
     </w:p>
     <w:sectPr>
       <w:pgSz w:w="11906" w:h="16838"/>

</xml_diff>

<commit_message>
start working with agent
</commit_message>
<xml_diff>
--- a/readme.docx
+++ b/readme.docx
@@ -111,7 +111,6 @@
     <w:p>
       <w:pPr>
         <w:rPr>
-          <w:rFonts w:hint="cs"/>
           <w:rtl/>
         </w:rPr>
       </w:pPr>
@@ -137,6 +136,45 @@
           <w:rtl/>
         </w:rPr>
       </w:pPr>
+      <w:r>
+        <w:rPr>
+          <w:rFonts w:hint="cs"/>
+          <w:rtl/>
+        </w:rPr>
+        <w:t xml:space="preserve">כפתור </w:t>
+      </w:r>
+      <w:proofErr w:type="spellStart"/>
+      <w:r>
+        <w:rPr>
+          <w:rFonts w:hint="cs"/>
+          <w:rtl/>
+        </w:rPr>
+        <w:t>רי</w:t>
+      </w:r>
+      <w:proofErr w:type="spellEnd"/>
+      <w:r>
+        <w:rPr>
+          <w:rFonts w:hint="cs"/>
+          <w:rtl/>
+        </w:rPr>
+        <w:t xml:space="preserve"> ראן מכין להרצה (רק שם את המשתנים בטבלת </w:t>
+      </w:r>
+      <w:proofErr w:type="spellStart"/>
+      <w:r>
+        <w:rPr>
+          <w:rFonts w:hint="cs"/>
+          <w:rtl/>
+        </w:rPr>
+        <w:t>האינפוטים</w:t>
+      </w:r>
+      <w:proofErr w:type="spellEnd"/>
+      <w:r>
+        <w:rPr>
+          <w:rFonts w:hint="cs"/>
+          <w:rtl/>
+        </w:rPr>
+        <w:t>)</w:t>
+      </w:r>
     </w:p>
     <w:sectPr>
       <w:pgSz w:w="11906" w:h="16838"/>

</xml_diff>